<commit_message>
Add documentation artifacts and consolidate imported worktree files
</commit_message>
<xml_diff>
--- a/README.docx
+++ b/README.docx
@@ -28,7 +28,7 @@
         </w:p>
       </w:sdtContent>
     </w:sdt>
-    <w:bookmarkStart w:id="29" w:name="hybridaiautomation"/>
+    <w:bookmarkStart w:id="30" w:name="hybridaiautomation"/>
     <w:p>
       <w:pPr>
         <w:pStyle w:val="Heading1"/>
@@ -670,7 +670,7 @@
       </w:r>
     </w:p>
     <w:bookmarkEnd w:id="14"/>
-    <w:bookmarkStart w:id="21" w:name="documentation"/>
+    <w:bookmarkStart w:id="22" w:name="documentation"/>
     <w:p>
       <w:pPr>
         <w:pStyle w:val="Heading2"/>
@@ -743,6 +743,23 @@
           <w:rPr>
             <w:rStyle w:val="Hyperlink"/>
           </w:rPr>
+          <w:t xml:space="preserve">Step-by-Step Testing Instructions</w:t>
+        </w:r>
+      </w:hyperlink>
+    </w:p>
+    <w:p>
+      <w:pPr>
+        <w:pStyle w:val="Compact"/>
+        <w:numPr>
+          <w:ilvl w:val="0"/>
+          <w:numId w:val="1007"/>
+        </w:numPr>
+      </w:pPr>
+      <w:hyperlink r:id="rId19">
+        <w:r>
+          <w:rPr>
+            <w:rStyle w:val="Hyperlink"/>
+          </w:rPr>
           <w:t xml:space="preserve">Invoice Workflow Guide</w:t>
         </w:r>
       </w:hyperlink>
@@ -755,7 +772,7 @@
           <w:numId w:val="1007"/>
         </w:numPr>
       </w:pPr>
-      <w:hyperlink r:id="rId19">
+      <w:hyperlink r:id="rId20">
         <w:r>
           <w:rPr>
             <w:rStyle w:val="Hyperlink"/>
@@ -772,7 +789,7 @@
           <w:numId w:val="1007"/>
         </w:numPr>
       </w:pPr>
-      <w:hyperlink r:id="rId20">
+      <w:hyperlink r:id="rId21">
         <w:r>
           <w:rPr>
             <w:rStyle w:val="Hyperlink"/>
@@ -781,8 +798,8 @@
         </w:r>
       </w:hyperlink>
     </w:p>
-    <w:bookmarkEnd w:id="21"/>
-    <w:bookmarkStart w:id="22" w:name="repository-structure"/>
+    <w:bookmarkEnd w:id="22"/>
+    <w:bookmarkStart w:id="23" w:name="repository-structure"/>
     <w:p>
       <w:pPr>
         <w:pStyle w:val="Heading2"/>
@@ -899,8 +916,8 @@
         <w:t xml:space="preserve">: business workflow definitions</w:t>
       </w:r>
     </w:p>
-    <w:bookmarkEnd w:id="22"/>
-    <w:bookmarkStart w:id="23" w:name="quality-gates"/>
+    <w:bookmarkEnd w:id="23"/>
+    <w:bookmarkStart w:id="24" w:name="quality-gates"/>
     <w:p>
       <w:pPr>
         <w:pStyle w:val="Heading2"/>
@@ -1079,8 +1096,8 @@
         <w:t xml:space="preserve">Docker Compose configuration and container builds</w:t>
       </w:r>
     </w:p>
-    <w:bookmarkEnd w:id="23"/>
-    <w:bookmarkStart w:id="24" w:name="version-040-focus"/>
+    <w:bookmarkEnd w:id="24"/>
+    <w:bookmarkStart w:id="25" w:name="version-040-focus"/>
     <w:p>
       <w:pPr>
         <w:pStyle w:val="Heading2"/>
@@ -1169,8 +1186,8 @@
         <w:t xml:space="preserve">workflow execution, and enterprise AI deployment</w:t>
       </w:r>
     </w:p>
-    <w:bookmarkEnd w:id="24"/>
-    <w:bookmarkStart w:id="25" w:name="reuse-priorities-from-local-ai-libraries"/>
+    <w:bookmarkEnd w:id="25"/>
+    <w:bookmarkStart w:id="26" w:name="reuse-priorities-from-local-ai-libraries"/>
     <w:p>
       <w:pPr>
         <w:pStyle w:val="Heading2"/>
@@ -1384,8 +1401,8 @@
         <w:t xml:space="preserve">broader than the current healthcare starter</w:t>
       </w:r>
     </w:p>
-    <w:bookmarkEnd w:id="25"/>
-    <w:bookmarkStart w:id="26" w:name="latest-platform-implications"/>
+    <w:bookmarkEnd w:id="26"/>
+    <w:bookmarkStart w:id="27" w:name="latest-platform-implications"/>
     <w:p>
       <w:pPr>
         <w:pStyle w:val="Heading2"/>
@@ -1534,8 +1551,8 @@
         <w:t xml:space="preserve">calling, which reduces integration friction for an OCI-first deployment path.</w:t>
       </w:r>
     </w:p>
-    <w:bookmarkEnd w:id="26"/>
-    <w:bookmarkStart w:id="27" w:name="roadmap"/>
+    <w:bookmarkEnd w:id="27"/>
+    <w:bookmarkStart w:id="28" w:name="roadmap"/>
     <w:p>
       <w:pPr>
         <w:pStyle w:val="Heading2"/>
@@ -1592,8 +1609,8 @@
         <w:t xml:space="preserve">Phase 4: Production OCI deployment with real ERP, FHIR, and vector services</w:t>
       </w:r>
     </w:p>
-    <w:bookmarkEnd w:id="27"/>
-    <w:bookmarkStart w:id="28" w:name="next-steps"/>
+    <w:bookmarkEnd w:id="28"/>
+    <w:bookmarkStart w:id="29" w:name="next-steps"/>
     <w:p>
       <w:pPr>
         <w:pStyle w:val="Heading2"/>
@@ -1662,8 +1679,8 @@
         <w:t xml:space="preserve">add customer-specific onboarding templates and security controls</w:t>
       </w:r>
     </w:p>
-    <w:bookmarkEnd w:id="28"/>
     <w:bookmarkEnd w:id="29"/>
+    <w:bookmarkEnd w:id="30"/>
     <w:sectPr>
       <w:footnotePr>
         <w:numRestart w:val="eachSect"/>

</xml_diff>